<commit_message>
fix: Career Highlights 14pt stat, 10pt label, max 2 words — locked gold standard format
</commit_message>
<xml_diff>
--- a/REFERENCE_FORMAT_RESUME.docx
+++ b/REFERENCE_FORMAT_RESUME.docx
@@ -147,8 +147,8 @@
               <w:rPr>
                 <w:b/>
                 <w:color w:val="1A3557"/>
-                <w:sz w:val="64"/>
-                <w:szCs w:val="64"/>
+                <w:sz w:val="28"/>
+                <w:szCs w:val="28"/>
                 <w:rFonts w:ascii="Calibri" w:hAnsi="Calibri"/>
                 <w:shd w:val="clear" w:color="auto" w:fill="E3F2F8"/>
               </w:rPr>
@@ -158,12 +158,12 @@
               <w:rPr>
                 <w:i/>
                 <w:color w:val="0D6E8A"/>
-                <w:sz w:val="36"/>
-                <w:szCs w:val="36"/>
+                <w:sz w:val="20"/>
+                <w:szCs w:val="20"/>
                 <w:rFonts w:ascii="Calibri" w:hAnsi="Calibri"/>
                 <w:shd w:val="clear" w:color="auto" w:fill="E3F2F8"/>
               </w:rPr>
-              <w:t xml:space="preserve"> Years Fintech Domain</w:t>
+              <w:t xml:space="preserve"> Yrs Experience</w:t>
             </w:r>
           </w:p>
         </w:tc>
@@ -187,8 +187,8 @@
             <w:r>
               <w:rPr>
                 <w:color w:val="888888"/>
-                <w:sz w:val="48"/>
-                <w:szCs w:val="48"/>
+                <w:sz w:val="22"/>
+                <w:szCs w:val="22"/>
                 <w:rFonts w:ascii="Calibri" w:hAnsi="Calibri"/>
                 <w:shd w:val="clear" w:color="auto" w:fill="E3F2F8"/>
               </w:rPr>
@@ -217,8 +217,8 @@
               <w:rPr>
                 <w:b/>
                 <w:color w:val="1A3557"/>
-                <w:sz w:val="64"/>
-                <w:szCs w:val="64"/>
+                <w:sz w:val="28"/>
+                <w:szCs w:val="28"/>
                 <w:rFonts w:ascii="Calibri" w:hAnsi="Calibri"/>
                 <w:shd w:val="clear" w:color="auto" w:fill="E3F2F8"/>
               </w:rPr>
@@ -228,8 +228,8 @@
               <w:rPr>
                 <w:i/>
                 <w:color w:val="0D6E8A"/>
-                <w:sz w:val="36"/>
-                <w:szCs w:val="36"/>
+                <w:sz w:val="20"/>
+                <w:szCs w:val="20"/>
                 <w:rFonts w:ascii="Calibri" w:hAnsi="Calibri"/>
                 <w:shd w:val="clear" w:color="auto" w:fill="E3F2F8"/>
               </w:rPr>
@@ -257,8 +257,8 @@
             <w:r>
               <w:rPr>
                 <w:color w:val="888888"/>
-                <w:sz w:val="48"/>
-                <w:szCs w:val="48"/>
+                <w:sz w:val="22"/>
+                <w:szCs w:val="22"/>
                 <w:rFonts w:ascii="Calibri" w:hAnsi="Calibri"/>
                 <w:shd w:val="clear" w:color="auto" w:fill="E3F2F8"/>
               </w:rPr>
@@ -287,8 +287,8 @@
               <w:rPr>
                 <w:b/>
                 <w:color w:val="1A3557"/>
-                <w:sz w:val="64"/>
-                <w:szCs w:val="64"/>
+                <w:sz w:val="28"/>
+                <w:szCs w:val="28"/>
                 <w:rFonts w:ascii="Calibri" w:hAnsi="Calibri"/>
                 <w:shd w:val="clear" w:color="auto" w:fill="E3F2F8"/>
               </w:rPr>
@@ -298,8 +298,8 @@
               <w:rPr>
                 <w:i/>
                 <w:color w:val="0D6E8A"/>
-                <w:sz w:val="36"/>
-                <w:szCs w:val="36"/>
+                <w:sz w:val="20"/>
+                <w:szCs w:val="20"/>
                 <w:rFonts w:ascii="Calibri" w:hAnsi="Calibri"/>
                 <w:shd w:val="clear" w:color="auto" w:fill="E3F2F8"/>
               </w:rPr>
@@ -330,8 +330,8 @@
               <w:rPr>
                 <w:b/>
                 <w:color w:val="1A3557"/>
-                <w:sz w:val="64"/>
-                <w:szCs w:val="64"/>
+                <w:sz w:val="28"/>
+                <w:szCs w:val="28"/>
                 <w:rFonts w:ascii="Calibri" w:hAnsi="Calibri"/>
                 <w:shd w:val="clear" w:color="auto" w:fill="E3F2F8"/>
               </w:rPr>
@@ -341,8 +341,8 @@
               <w:rPr>
                 <w:i/>
                 <w:color w:val="0D6E8A"/>
-                <w:sz w:val="36"/>
-                <w:szCs w:val="36"/>
+                <w:sz w:val="20"/>
+                <w:szCs w:val="20"/>
                 <w:rFonts w:ascii="Calibri" w:hAnsi="Calibri"/>
                 <w:shd w:val="clear" w:color="auto" w:fill="E3F2F8"/>
               </w:rPr>
@@ -370,8 +370,8 @@
             <w:r>
               <w:rPr>
                 <w:color w:val="888888"/>
-                <w:sz w:val="48"/>
-                <w:szCs w:val="48"/>
+                <w:sz w:val="22"/>
+                <w:szCs w:val="22"/>
                 <w:rFonts w:ascii="Calibri" w:hAnsi="Calibri"/>
                 <w:shd w:val="clear" w:color="auto" w:fill="E3F2F8"/>
               </w:rPr>
@@ -400,8 +400,8 @@
               <w:rPr>
                 <w:b/>
                 <w:color w:val="1A3557"/>
-                <w:sz w:val="64"/>
-                <w:szCs w:val="64"/>
+                <w:sz w:val="28"/>
+                <w:szCs w:val="28"/>
                 <w:rFonts w:ascii="Calibri" w:hAnsi="Calibri"/>
                 <w:shd w:val="clear" w:color="auto" w:fill="E3F2F8"/>
               </w:rPr>
@@ -411,8 +411,8 @@
               <w:rPr>
                 <w:i/>
                 <w:color w:val="0D6E8A"/>
-                <w:sz w:val="36"/>
-                <w:szCs w:val="36"/>
+                <w:sz w:val="20"/>
+                <w:szCs w:val="20"/>
                 <w:rFonts w:ascii="Calibri" w:hAnsi="Calibri"/>
                 <w:shd w:val="clear" w:color="auto" w:fill="E3F2F8"/>
               </w:rPr>
@@ -440,8 +440,8 @@
             <w:r>
               <w:rPr>
                 <w:color w:val="888888"/>
-                <w:sz w:val="48"/>
-                <w:szCs w:val="48"/>
+                <w:sz w:val="22"/>
+                <w:szCs w:val="22"/>
                 <w:rFonts w:ascii="Calibri" w:hAnsi="Calibri"/>
                 <w:shd w:val="clear" w:color="auto" w:fill="E3F2F8"/>
               </w:rPr>
@@ -470,8 +470,8 @@
               <w:rPr>
                 <w:b/>
                 <w:color w:val="1A3557"/>
-                <w:sz w:val="64"/>
-                <w:szCs w:val="64"/>
+                <w:sz w:val="28"/>
+                <w:szCs w:val="28"/>
                 <w:rFonts w:ascii="Calibri" w:hAnsi="Calibri"/>
                 <w:shd w:val="clear" w:color="auto" w:fill="E3F2F8"/>
               </w:rPr>
@@ -481,8 +481,8 @@
               <w:rPr>
                 <w:i/>
                 <w:color w:val="0D6E8A"/>
-                <w:sz w:val="36"/>
-                <w:szCs w:val="36"/>
+                <w:sz w:val="20"/>
+                <w:szCs w:val="20"/>
                 <w:rFonts w:ascii="Calibri" w:hAnsi="Calibri"/>
                 <w:shd w:val="clear" w:color="auto" w:fill="E3F2F8"/>
               </w:rPr>

</xml_diff>